<commit_message>
Resume: Data & AI Governance Compliance Analyst @ Booking Holdings (MNC)
</commit_message>
<xml_diff>
--- a/resumes/Resume_Data___AI_Governance_Compliance_Ana_Booking_Holdings__MNC_.docx
+++ b/resumes/Resume_Data___AI_Governance_Compliance_Ana_Booking_Holdings__MNC_.docx
@@ -600,7 +600,7 @@
           <w:sz w:val="19"/>
           <w:szCs w:val="19"/>
         </w:rPr>
-        <w:t>Deployed Telegram bot interface enabling analysts to submit URLs for live ioc enrichment (threat intelligence); supports bulk CSV input/output for incident response workflows and includes osint enrichment (open-source intelligence) via theHarvester for domain profiling.</w:t>
+        <w:t>Deployed Telegram bot interface enabling analysts to submit URLs for live IOC enrichment (threat intelligence); supports bulk CSV input/output for incident response workflows and includes OSINT enrichment (open-source intelligence) via theHarvester for domain profiling.</w:t>
       </w:r>
       <w:proofErr w:type="spellStart"/>
       <w:r>
@@ -661,7 +661,7 @@
             <w:color w:val="000000"/>
             <w:u w:val="single"/>
           </w:rPr>
-          <w:t>Data Security and Risk Management Vulnerability Scanner and Patch Prioritization Engine</w:t>
+          <w:t>Data Compliance and AI Compliance Vulnerability Scanner and Patch Prioritization Engine</w:t>
         </w:r>
       </w:hyperlink>
       <w:r>
@@ -698,7 +698,7 @@
           <w:sz w:val="19"/>
           <w:szCs w:val="19"/>
         </w:rPr>
-        <w:t>Built automated vulnerability assessment pipeline integrating Nessus and OpenVAS REST APIs in Python; generates CVE reports classified by cvss severity (vulnerability prioritisation); implemented epss scoring (exploit probability scoring) from FIRST.org API to prioritise by actual exploit probability — a metric rarely used by freshers.</w:t>
+        <w:t>Built automated vulnerability assessment pipeline integrating Nessus and OpenVAS REST APIs in Python; generates CVE reports classified by CVSS severity (vulnerability prioritisation); implemented EPSS scoring (exploit probability scoring) from FIRST.org API to prioritise by actual exploit probability — a metric rarely used by freshers.</w:t>
       </w:r>
     </w:p>
     <w:p>
@@ -717,7 +717,7 @@
           <w:sz w:val="19"/>
           <w:szCs w:val="19"/>
         </w:rPr>
-        <w:t>Developed owasp top 10 (web application security) automated web checker that sends crafted HTTP requests to detect injection, broken auth, and SSRF vulnerabilities; documented SQL injection exploit and parameterised query remediation.</w:t>
+        <w:t>Developed OWASP Top 10 (web application security) automated web checker that sends crafted HTTP requests to detect injection, broken auth, and SSRF vulnerabilities; documented SQL injection exploit and parameterised query remediation.</w:t>
       </w:r>
     </w:p>
     <w:p>

</xml_diff>